<commit_message>
Terminlistekontroll i admin (bane og gateløp, purreliste); NFIF-svar 1.5 om innsamling fra to steder
Co-Authored-By: Claude Opus 5.5 <noreply@anthropic.com>
</commit_message>
<xml_diff>
--- a/NFIFProsjekt/avklaring/Svar – Avklaringsspørsmål – Athlete Mindset.docx
+++ b/NFIFProsjekt/avklaring/Svar – Avklaringsspørsmål – Athlete Mindset.docx
@@ -393,7 +393,7 @@
               <w:spacing w:before="60" w:after="80"/>
             </w:pPr>
             <w:r>
-              <w:t xml:space="preserve">Første sesong blir behovet noe større, anslagsvis 2–3 timer i uken, fordi kontrollene skal justeres etter NFIFs praksis. Når terminlisten og lisensregisteret er koblet til, settes kvalitetsnivået maskinelt. Da går behovet ned mot ren rekordgodkjenning.</w:t>
+              <w:t xml:space="preserve">Første sesong blir behovet noe større, anslagsvis 2–3 timer i uken, fordi kontrollene skal justeres etter NFIFs praksis. Når også lisensregisteret er koblet til, settes kvalitetsnivået maskinelt. Da går behovet ned mot ren rekordgodkjenning.</w:t>
             </w:r>
           </w:p>
           <w:p>
@@ -401,7 +401,15 @@
               <w:spacing w:before="60" w:after="80"/>
             </w:pPr>
             <w:r>
-              <w:t xml:space="preserve">I tillegg kommer to engangsoppgaver ved oppstart: klubbenes kretstilhørighet, og tilgang til terminliste og lisensregister.</w:t>
+              <w:t xml:space="preserve">Purring på arrangører som ikke har sendt resultater, gjør vi selv. Arrangementene som mangler, finner vi ved å kontrollere terminlisten mot basen hver natt, jf. svar 1.5.</w:t>
+            </w:r>
+          </w:p>
+          <w:p>
+            <w:pPr>
+              <w:spacing w:before="60" w:after="80"/>
+            </w:pPr>
+            <w:r>
+              <w:t xml:space="preserve">I tillegg kommer to engangsoppgaver ved oppstart: klubbenes kretstilhørighet, og tilgang til lisensregisteret.</w:t>
             </w:r>
           </w:p>
         </w:tc>
@@ -1299,6 +1307,25 @@
                 <w:b/>
                 <w:bCs/>
               </w:rPr>
+              <w:t xml:space="preserve">Terminliste:</w:t>
+            </w:r>
+            <w:r>
+              <w:t xml:space="preserve"> hvilke arrangementer i terminlisten som mangler resultater, hvor lenge de har manglet, og om arrangøren er purret. En purreliste samler det som mangler per arrangør, med ferdig e-postutkast. Denne delen er ny siden presentasjonen.</w:t>
+            </w:r>
+          </w:p>
+          <w:p>
+            <w:pPr>
+              <w:spacing w:before="0" w:after="40"/>
+              <w:ind w:left="284" w:hanging="227"/>
+            </w:pPr>
+            <w:r>
+              <w:t xml:space="preserve">–	</w:t>
+            </w:r>
+            <w:r>
+              <w:rPr>
+                <w:b/>
+                <w:bCs/>
+              </w:rPr>
               <w:t xml:space="preserve">Import:</w:t>
             </w:r>
             <w:r>
@@ -2061,26 +2088,87 @@
               <w:spacing w:before="60" w:after="80"/>
             </w:pPr>
             <w:r>
-              <w:t xml:space="preserve">I dag hentes alle baneresultater automatisk hver natt. De siste seks ukene kontrolleres i tillegg på nytt mot kilden, slik at rettelser kommer med. Status for de enkelte systemene:</w:t>
-            </w:r>
-          </w:p>
-          <w:p>
-            <w:pPr>
-              <w:spacing w:before="0" w:after="40"/>
-              <w:ind w:left="284" w:hanging="227"/>
-            </w:pPr>
-            <w:r>
-              <w:t xml:space="preserve">–	</w:t>
-            </w:r>
-            <w:r>
-              <w:rPr>
-                <w:b/>
-                <w:bCs/>
-              </w:rPr>
-              <w:t xml:space="preserve">iSonen (terminliste og lisensregister):</w:t>
-            </w:r>
-            <w:r>
-              <w:t xml:space="preserve"> ikke utviklet. Avhenger av tilgang fra NFIF og Buypass. Integrasjonen trengs for å sette kvalitetsnivå maskinelt. Q1 2027, etter at tilgang er gitt.</w:t>
+              <w:t xml:space="preserve">Resultatene skal samles inn fra to steder:</w:t>
+            </w:r>
+          </w:p>
+          <w:p>
+            <w:pPr>
+              <w:spacing w:before="0" w:after="40"/>
+              <w:ind w:left="284" w:hanging="227"/>
+            </w:pPr>
+            <w:r>
+              <w:t xml:space="preserve">–	</w:t>
+            </w:r>
+            <w:r>
+              <w:rPr>
+                <w:b/>
+                <w:bCs/>
+              </w:rPr>
+              <w:t xml:space="preserve">Resultatlister som kommer inn til Norsk Friidrett.</w:t>
+            </w:r>
+            <w:r>
+              <w:t xml:space="preserve"> De fleste kommer gjennom iSonen, resten som filer fra FriRes og LiveRes, OpenTrack og tidtakerne. Plattformen tar imot alle, og alle går gjennom de samme kontrollene.</w:t>
+            </w:r>
+          </w:p>
+          <w:p>
+            <w:pPr>
+              <w:spacing w:before="0" w:after="40"/>
+              <w:ind w:left="284" w:hanging="227"/>
+            </w:pPr>
+            <w:r>
+              <w:t xml:space="preserve">–	</w:t>
+            </w:r>
+            <w:r>
+              <w:rPr>
+                <w:b/>
+                <w:bCs/>
+              </w:rPr>
+              <w:t xml:space="preserve">Resultater vi henter selv.</w:t>
+            </w:r>
+            <w:r>
+              <w:t xml:space="preserve"> Et eget system søker opp norske utøveres resultater rundt i verden. Søket tar utgangspunkt i utøveren, ikke i stevnet: World Athletics-profiler, TFRRS for collegeutøvere i USA, og resultattjenestene i andre land. Utøvere og klubber kan i tillegg melde inn resultater med dokumentasjon.</w:t>
+            </w:r>
+          </w:p>
+          <w:p>
+            <w:pPr>
+              <w:spacing w:before="60" w:after="80"/>
+            </w:pPr>
+            <w:r>
+              <w:rPr>
+                <w:b/>
+                <w:bCs/>
+              </w:rPr>
+              <w:t xml:space="preserve">Kontroll av at alt er kommet inn.</w:t>
+            </w:r>
+            <w:r>
+              <w:t xml:space="preserve"> Terminlisten hentes hver natt, og hvert avholdt arrangement kontrolleres mot resultatene i basen. Arrangementer som mangler resultater tre dager etter siste stevnedag, vises i administrasjonsverktøyet, og arrangøren purres etter en uke. Dette er i drift, både for banestevner og gateløp.</w:t>
+            </w:r>
+          </w:p>
+          <w:p>
+            <w:pPr>
+              <w:spacing w:before="60" w:after="80"/>
+            </w:pPr>
+            <w:r>
+              <w:t xml:space="preserve">Status for de enkelte systemene:</w:t>
+            </w:r>
+          </w:p>
+          <w:p>
+            <w:pPr>
+              <w:spacing w:before="0" w:after="40"/>
+              <w:ind w:left="284" w:hanging="227"/>
+            </w:pPr>
+            <w:r>
+              <w:t xml:space="preserve">–	</w:t>
+            </w:r>
+            <w:r>
+              <w:rPr>
+                <w:b/>
+                <w:bCs/>
+              </w:rPr>
+              <w:t xml:space="preserve">iSonen:</w:t>
+            </w:r>
+            <w:r>
+              <w:t xml:space="preserve"> API-tilgang forutsetter avtale med NFIF og Buypass, og vi tar kontakt om dette etter en eventuell tildeling. Frem til da brukes den åpne terminlisten til kontrollen over. Q1 2027, etter at tilgang er gitt.</w:t>
             </w:r>
           </w:p>
           <w:p>
@@ -2099,7 +2187,7 @@
               <w:t xml:space="preserve">FriRes og LiveRes:</w:t>
             </w:r>
             <w:r>
-              <w:t xml:space="preserve"> resultatlister fra FriRes kan lastes opp som fil i administrasjonsverktøyet i dag. Direkte overføring fra LiveRes krever et avtalt format, og vi vil gjerne utforme det sammen med utvikleren.</w:t>
+              <w:t xml:space="preserve"> vi har direkte tilgang til LiveRes' datastrøm, avtalt med utvikleren. Den gir stevnelisten og fullstendige resultatlister per stevnedag, med FriSys-id, fødselsdato, klubb, vind og hvert forsøk. Importen kan bygges nå.</w:t>
             </w:r>
           </w:p>
           <w:p>
@@ -2137,7 +2225,7 @@
               <w:t xml:space="preserve">EQ Timing:</w:t>
             </w:r>
             <w:r>
-              <w:t xml:space="preserve"> fungerer som prototype, jf. svar 1.2. Importen bruker EQ Timings åpne resultattjeneste. For varig drift ønsker vi en avtale med EQ Timing om grensesnittet og varsling ved endringer.</w:t>
+              <w:t xml:space="preserve"> fungerer som prototype, jf. svar 1.2. Importen bruker EQ Timings åpne resultattjeneste. For varig drift ønsker vi en avtale om grensesnittet og varsling ved endringer.</w:t>
             </w:r>
           </w:p>
           <w:p>
@@ -2164,7 +2252,7 @@
               <w:spacing w:before="60" w:after="80"/>
             </w:pPr>
             <w:r>
-              <w:t xml:space="preserve">Dersom API-tilgang ikke blir gitt, stopper ikke løsningen opp. Resultatlister kan lastes opp som fil (CSV, Excel eller FriRes) i administrasjonsverktøyet, og de går gjennom de samme kontrollene. Offentlige resultatsider kan hentes der tidtakeren tillater det. Det gir mer manuelt arbeid, men ikke tapte resultater. Uten terminliste og lisensregister settes kvalitetsnivået ut fra stevnenivå og tidtaking, og det overstyres manuelt der det trengs.</w:t>
+              <w:t xml:space="preserve">Dersom API-tilgang ikke blir gitt, stopper ikke løsningen opp. Resultatlister kan lastes opp som fil (CSV, Excel eller FriRes) i administrasjonsverktøyet, og de går gjennom de samme kontrollene. Offentlige resultatsider kan hentes der tidtakeren tillater det. Det gir mer manuelt arbeid, men terminlistekontrollen sikrer at ingenting faller ut i det stille. Uten lisensregisteret settes kvalitetsnivået ut fra stevnenivå og tidtaking, og det overstyres manuelt der det trengs.</w:t>
             </w:r>
           </w:p>
         </w:tc>
@@ -2499,19 +2587,31 @@
               <w:t xml:space="preserve">–	</w:t>
             </w:r>
             <w:r>
-              <w:t xml:space="preserve">Manglende kjønn, fødselsår eller vind, kontrollert mot kilden.</w:t>
-            </w:r>
-          </w:p>
-          <w:p>
-            <w:pPr>
-              <w:spacing w:before="0" w:after="40"/>
-              <w:ind w:left="284" w:hanging="227"/>
-            </w:pPr>
-            <w:r>
-              <w:t xml:space="preserve">–	</w:t>
-            </w:r>
-            <w:r>
-              <w:t xml:space="preserve">Avstemming mot kilden, og retting når kilden endres.</w:t>
+              <w:t xml:space="preserve">Manglende kjønn, fødselsår eller vind, kontrollert mot resultatlisten.</w:t>
+            </w:r>
+          </w:p>
+          <w:p>
+            <w:pPr>
+              <w:spacing w:before="0" w:after="40"/>
+              <w:ind w:left="284" w:hanging="227"/>
+            </w:pPr>
+            <w:r>
+              <w:t xml:space="preserve">–	</w:t>
+            </w:r>
+            <w:r>
+              <w:t xml:space="preserve">Retting når en arrangør sender en korrigert resultatliste.</w:t>
+            </w:r>
+          </w:p>
+          <w:p>
+            <w:pPr>
+              <w:spacing w:before="0" w:after="40"/>
+              <w:ind w:left="284" w:hanging="227"/>
+            </w:pPr>
+            <w:r>
+              <w:t xml:space="preserve">–	</w:t>
+            </w:r>
+            <w:r>
+              <w:t xml:space="preserve">Oppfølging og purring av arrangører som ikke har sendt resultater, ut fra terminlisten.</w:t>
             </w:r>
           </w:p>
           <w:p>
@@ -2965,7 +3065,7 @@
               <w:t xml:space="preserve">–	</w:t>
             </w:r>
             <w:r>
-              <w:t xml:space="preserve">Nattlig import og avstemming mot kilden, med automatiske kontroller og avviksliste.</w:t>
+              <w:t xml:space="preserve">Automatiske kontroller med avviksliste, og nattlig kontroll mot terminlisten med purreliste.</w:t>
             </w:r>
           </w:p>
           <w:p>
@@ -3061,7 +3161,7 @@
               <w:t xml:space="preserve">–	</w:t>
             </w:r>
             <w:r>
-              <w:t xml:space="preserve">Egen innsamling av resultatlister direkte fra arrangører og tidtakere, i parallell drift med dagens kilde til NFIF bekrefter overgangen.</w:t>
+              <w:t xml:space="preserve">Innsamling av resultatlister fra LiveRes og tidtakerne, og første versjon av søket etter norske resultater i utlandet.</w:t>
             </w:r>
           </w:p>
           <w:p>
@@ -3097,7 +3197,7 @@
               <w:t xml:space="preserve">–	</w:t>
             </w:r>
             <w:r>
-              <w:t xml:space="preserve">Integrasjoner, jf. svar 1.5. Q1–Q3.</w:t>
+              <w:t xml:space="preserve">Integrasjoner, med iSonen etter avtale, jf. svar 1.5. Q1–Q3.</w:t>
             </w:r>
           </w:p>
           <w:p>
@@ -3145,7 +3245,7 @@
               <w:t xml:space="preserve">–	</w:t>
             </w:r>
             <w:r>
-              <w:t xml:space="preserve">Maskinelt kvalitetsnivå: tilgang til terminliste og lisensregister fra NFIF og Buypass.</w:t>
+              <w:t xml:space="preserve">Maskinelt kvalitetsnivå: tilgang til lisensregisteret fra NFIF og Buypass. Terminlisten er allerede i bruk.</w:t>
             </w:r>
           </w:p>
           <w:p>

</xml_diff>

<commit_message>
NFIF-svar: innsendte resultatlister i 1.3 og 1.5, endelig versjon uten utheving
Co-Authored-By: Claude Opus 5.5 <noreply@anthropic.com>
</commit_message>
<xml_diff>
--- a/NFIFProsjekt/avklaring/Svar – Avklaringsspørsmål – Athlete Mindset.docx
+++ b/NFIFProsjekt/avklaring/Svar – Avklaringsspørsmål – Athlete Mindset.docx
@@ -304,7 +304,7 @@
               <w:spacing w:before="60" w:after="80"/>
             </w:pPr>
             <w:r>
-              <w:t xml:space="preserve">I en typisk uke i stevnesesongen trenger vi lite tid fra Norsk Friidrett. Plattformen kontrollerer alle nye resultater hver natt, og vi behandler det meste selv. Det som krever forbundets myndighet, legger vi frem ferdig utredet.</w:t>
+              <w:t xml:space="preserve">Utgangspunktet er at Norsk Friidrett bare skal ha de oppgavene som ligger til forbundet etter regelverket: godkjenne rekorder og bestenoteringer, avklare uregelmessigheter og underkjenne resultater. Resten tar vi.</w:t>
             </w:r>
           </w:p>
           <w:p>
@@ -312,7 +312,7 @@
               <w:spacing w:before="60" w:after="80"/>
             </w:pPr>
             <w:r>
-              <w:t xml:space="preserve">Anslaget bygger på 2026-sesongen. Vi kjørte de automatiske kontrollene på alle 54 198 baneresultater fra 2026. De fant 301 avvik, fra 5 til 20 i uken i sesongen. Om lag 45 av dem var mulige rekorder eller bestenoteringer.</w:t>
+              <w:t xml:space="preserve">Athlete Mindset AS har solid kjennskap til friidrett og vil avklare de aller fleste avvik på egen hånd. Plattformen kontrollerer alle nye resultater hver natt. Vi holder også kontakten med arrangørene når det er spørsmål om resultatlister. Da slipper forbundet et ledd. Arrangementene som mangler, finner vi ved å kontrollere terminlisten mot basen hver natt, jf. svar 1.5.</w:t>
             </w:r>
           </w:p>
           <w:p>
@@ -339,7 +339,7 @@
               <w:t xml:space="preserve">Godkjenning av rekorder og bestenoteringer.</w:t>
             </w:r>
             <w:r>
-              <w:t xml:space="preserve"> 1–2 saker i uken i sesongen. Vi legger frem resultat, vind, tidtaking og stevnestatus. Om lag 15 minutter per sak.</w:t>
+              <w:t xml:space="preserve"> Vi legger frem resultat, vind, tidtaking og stevnestatus ferdig utredet.</w:t>
             </w:r>
           </w:p>
           <w:p>
@@ -358,7 +358,7 @@
               <w:t xml:space="preserve">Underkjenning av stevner og resultater.</w:t>
             </w:r>
             <w:r>
-              <w:t xml:space="preserve"> Sjelden. NFIF melder fra, og vi registrerer underkjenningen med årsakskode.</w:t>
+              <w:t xml:space="preserve"> Vi registrerer underkjenningen med årsak, og resultatet holdes utenfor lister og rekorder.</w:t>
             </w:r>
           </w:p>
           <w:p>
@@ -377,7 +377,7 @@
               <w:t xml:space="preserve">Regeltolkning i tvilstilfeller.</w:t>
             </w:r>
             <w:r>
-              <w:t xml:space="preserve"> For eksempel redskap, blandede heat og utenlandske utøvere. Vi foreslår at fagrådet i tilbudets kapittel 9.4 tar disse.</w:t>
+              <w:t xml:space="preserve"> For eksempel redskap, blandede heat og utenlandske utøvere.</w:t>
             </w:r>
           </w:p>
           <w:p>
@@ -385,7 +385,14 @@
               <w:spacing w:before="60" w:after="80"/>
             </w:pPr>
             <w:r>
-              <w:t xml:space="preserve">Samlet anslår vi 1–2 timer i uken i høysesongen, og under én time i uken ellers. Kompetansen som trengs, er den statistikkansvarlig og SRU har i dag: rekordregler og regelverk. Det trengs ingen teknisk kompetanse.</w:t>
+              <w:rPr>
+                <w:b/>
+                <w:bCs/>
+              </w:rPr>
+              <w:t xml:space="preserve">Tidsbruk.</w:t>
+            </w:r>
+            <w:r>
+              <w:t xml:space="preserve"> Samlet bør dette ta under én time i uken i høysesongen. Anslaget bygger på 2026-sesongen. De automatiske kontrollene fant 301 avvik i 54 198 baneresultater, fra 5 til 20 i uken. Om lag 45 av dem var mulige rekorder eller bestenoteringer, altså 1–2 saker i uken som krever forbundets godkjenning. Resten kan vi avklare selv.</w:t>
             </w:r>
           </w:p>
           <w:p>
@@ -393,7 +400,14 @@
               <w:spacing w:before="60" w:after="80"/>
             </w:pPr>
             <w:r>
-              <w:t xml:space="preserve">Første sesong blir behovet noe større, anslagsvis 2–3 timer i uken, fordi kontrollene skal justeres etter NFIFs praksis. Når også lisensregisteret er koblet til, settes kvalitetsnivået maskinelt. Da går behovet ned mot ren rekordgodkjenning.</w:t>
+              <w:rPr>
+                <w:b/>
+                <w:bCs/>
+              </w:rPr>
+              <w:t xml:space="preserve">Kompetanse.</w:t>
+            </w:r>
+            <w:r>
+              <w:t xml:space="preserve"> Det som trengs, er den kompetansen statistikkansvarlig og SRU har i dag: rekordregler og regelverk. Det trengs ingen teknisk kompetanse.</w:t>
             </w:r>
           </w:p>
           <w:p>
@@ -401,7 +415,14 @@
               <w:spacing w:before="60" w:after="80"/>
             </w:pPr>
             <w:r>
-              <w:t xml:space="preserve">Purring på arrangører som ikke har sendt resultater, gjør vi selv. Arrangementene som mangler, finner vi ved å kontrollere terminlisten mot basen hver natt, jf. svar 1.5.</w:t>
+              <w:rPr>
+                <w:b/>
+                <w:bCs/>
+              </w:rPr>
+              <w:t xml:space="preserve">Endring over tid.</w:t>
+            </w:r>
+            <w:r>
+              <w:t xml:space="preserve"> Første sesong kan behovet bli noe større, fordi kontrollene skal justeres etter NFIFs praksis. Vi har heller ikke full klarhet i hvilke resultater som skal registreres, særlig for løp utenfor bane. Alle eldre resultater ligger i basen, men det trengs noen grensedragninger, blant annet for vind. Etter første sesong, og når lisensregisteret er koblet til, går behovet ned mot ren godkjenning av rekorder.</w:t>
             </w:r>
           </w:p>
           <w:p>
@@ -409,7 +430,55 @@
               <w:spacing w:before="60" w:after="80"/>
             </w:pPr>
             <w:r>
-              <w:t xml:space="preserve">I tillegg kommer to engangsoppgaver ved oppstart: klubbenes kretstilhørighet, og tilgang til lisensregisteret.</w:t>
+              <w:t xml:space="preserve">I tillegg kommer noen engangsoppgaver ved oppstart:</w:t>
+            </w:r>
+          </w:p>
+          <w:p>
+            <w:pPr>
+              <w:spacing w:before="0" w:after="40"/>
+              <w:ind w:left="284" w:hanging="227"/>
+            </w:pPr>
+            <w:r>
+              <w:t xml:space="preserve">–	</w:t>
+            </w:r>
+            <w:r>
+              <w:t xml:space="preserve">klubbenes kretstilhørighet</w:t>
+            </w:r>
+          </w:p>
+          <w:p>
+            <w:pPr>
+              <w:spacing w:before="0" w:after="40"/>
+              <w:ind w:left="284" w:hanging="227"/>
+            </w:pPr>
+            <w:r>
+              <w:t xml:space="preserve">–	</w:t>
+            </w:r>
+            <w:r>
+              <w:t xml:space="preserve">tilgang til lisensregisteret</w:t>
+            </w:r>
+          </w:p>
+          <w:p>
+            <w:pPr>
+              <w:spacing w:before="0" w:after="40"/>
+              <w:ind w:left="284" w:hanging="227"/>
+            </w:pPr>
+            <w:r>
+              <w:t xml:space="preserve">–	</w:t>
+            </w:r>
+            <w:r>
+              <w:t xml:space="preserve">hjelp til å få tilgang til API-ene i iSonen</w:t>
+            </w:r>
+          </w:p>
+          <w:p>
+            <w:pPr>
+              <w:spacing w:before="0" w:after="40"/>
+              <w:ind w:left="284" w:hanging="227"/>
+            </w:pPr>
+            <w:r>
+              <w:t xml:space="preserve">–	</w:t>
+            </w:r>
+            <w:r>
+              <w:t xml:space="preserve">en grundig gjennomgang av eldre statistikk, for eksempel sammen med SRU. Deler av den gamle statistikken har svakheter, og en felles gjennomgang sikrer at listene er riktige per 1.1.2027.</w:t>
             </w:r>
           </w:p>
         </w:tc>
@@ -730,7 +799,45 @@
               <w:t xml:space="preserve">Automatisk import fra EQ Timing</w:t>
             </w:r>
             <w:r>
-              <w:t xml:space="preserve"> av alle arrangementer under Norges Friidrettsforbund. Fra 1. september til 14. oktober 2026 gir det 155 arrangementer, 367 løp og 38 893 resultater.</w:t>
+              <w:t xml:space="preserve"> av alle arrangementer under Norges Friidrettsforbund. Fra 1. januar til 14. oktober 2026 gir det 640 arrangementer, 1 582 løp og 158 793 resultater.</w:t>
+            </w:r>
+          </w:p>
+          <w:p>
+            <w:pPr>
+              <w:spacing w:before="0" w:after="40"/>
+              <w:ind w:left="284" w:hanging="227"/>
+            </w:pPr>
+            <w:r>
+              <w:t xml:space="preserve">–	</w:t>
+            </w:r>
+            <w:r>
+              <w:rPr>
+                <w:b/>
+                <w:bCs/>
+              </w:rPr>
+              <w:t xml:space="preserve">Import fra Ultimate Sport Service</w:t>
+            </w:r>
+            <w:r>
+              <w:t xml:space="preserve">, som tar tid i blant annet Oslo Maraton. Importen er bygget, med netto- og bruttotid, og testet på de første løpene i 2026.</w:t>
+            </w:r>
+          </w:p>
+          <w:p>
+            <w:pPr>
+              <w:spacing w:before="0" w:after="40"/>
+              <w:ind w:left="284" w:hanging="227"/>
+            </w:pPr>
+            <w:r>
+              <w:t xml:space="preserve">–	</w:t>
+            </w:r>
+            <w:r>
+              <w:rPr>
+                <w:b/>
+                <w:bCs/>
+              </w:rPr>
+              <w:t xml:space="preserve">Metadata per løp</w:t>
+            </w:r>
+            <w:r>
+              <w:t xml:space="preserve">, slik kravspesifikasjonens punkt 8 ber om: distanse, løpstype (gate, terreng, motbakke, fjell, ultra, stafett), løypemåling, tidtaker, arrangør, sted, dato, antall deltakere og fullførte, og klubb. Kjønns- og aldersfordeling kan regnes ut fra resultatene.</w:t>
             </w:r>
           </w:p>
           <w:p>
@@ -749,7 +856,7 @@
               <w:t xml:space="preserve">Kvalitetsnivå A, B og C, satt maskinelt</w:t>
             </w:r>
             <w:r>
-              <w:t xml:space="preserve"> ut fra EQ Timings løypegradering (sertifisert målt løype, A-, B- eller C-måling), distansen og typen løp. Terreng-, motbakke- og fjelløp regnes foreløpig som registrert aktivitet (nivå C). Løp der vinnertiden er umulig for oppgitt distanse, flagges og settes også til nivå C.</w:t>
+              <w:t xml:space="preserve"> ut fra tidtakerens løypegradering (sertifisert målt løype, A-, B- eller C-måling), distansen og typen løp. Terreng-, motbakke- og fjelløp regnes foreløpig som registrert aktivitet (nivå C). Løp der vinnertiden er umulig for oppgitt distanse, flagges og settes også til nivå C.</w:t>
             </w:r>
           </w:p>
           <w:p>
@@ -768,7 +875,7 @@
               <w:t xml:space="preserve">Årsbeste på 5 km, 10 km, halvmaraton og maraton</w:t>
             </w:r>
             <w:r>
-              <w:t xml:space="preserve">, én rad per løper, med filter på kvalitetsnivå.</w:t>
+              <w:t xml:space="preserve">, én rad per løper, med filter på kvalitetsnivå, kjønn og aldersklasse. Utenlandske løpere står bare med når de representerer en norsk klubb, og merkes da med stjerne.</w:t>
             </w:r>
           </w:p>
           <w:p>
@@ -787,7 +894,26 @@
               <w:t xml:space="preserve">Kobling til utøverregisteret</w:t>
             </w:r>
             <w:r>
-              <w:t xml:space="preserve"> på navn, kjønn og fødselsår. 3 396 løpere er koblet automatisk.</w:t>
+              <w:t xml:space="preserve"> på navn, kjønn og fødselsår. 13 159 resultater er koblet automatisk.</w:t>
+            </w:r>
+          </w:p>
+          <w:p>
+            <w:pPr>
+              <w:spacing w:before="0" w:after="40"/>
+              <w:ind w:left="284" w:hanging="227"/>
+            </w:pPr>
+            <w:r>
+              <w:t xml:space="preserve">–	</w:t>
+            </w:r>
+            <w:r>
+              <w:rPr>
+                <w:b/>
+                <w:bCs/>
+              </w:rPr>
+              <w:t xml:space="preserve">Kontroll mot terminlisten.</w:t>
+            </w:r>
+            <w:r>
+              <w:t xml:space="preserve"> Gateløpene på terminlisten kontrolleres mot basen hver natt, slik som banestevnene (svar 1.5).</w:t>
             </w:r>
           </w:p>
           <w:p>
@@ -811,10 +937,29 @@
                 <w:b/>
                 <w:bCs/>
               </w:rPr>
+              <w:t xml:space="preserve">Avklaring med NFIF om hvilke resultater som skal inn i statistikken.</w:t>
+            </w:r>
+            <w:r>
+              <w:t xml:space="preserve"> Det er ikke gitt at alle deltakere i et mosjonsløp skal med. Resten av 2026 fra Ultimate Sport Service importeres når dette er avklart.</w:t>
+            </w:r>
+          </w:p>
+          <w:p>
+            <w:pPr>
+              <w:spacing w:before="0" w:after="40"/>
+              <w:ind w:left="284" w:hanging="227"/>
+            </w:pPr>
+            <w:r>
+              <w:t xml:space="preserve">–	</w:t>
+            </w:r>
+            <w:r>
+              <w:rPr>
+                <w:b/>
+                <w:bCs/>
+              </w:rPr>
               <w:t xml:space="preserve">Flere tidtakere</w:t>
             </w:r>
             <w:r>
-              <w:t xml:space="preserve">, først Ultimate Sport Service. Q1 2027.</w:t>
+              <w:t xml:space="preserve">, blant annet Racedays, der API-nøkkel er etterspurt. Q1 2027.</w:t>
             </w:r>
           </w:p>
           <w:p>
@@ -890,23 +1035,23 @@
               <w:t xml:space="preserve">Samlet utøverprofil</w:t>
             </w:r>
             <w:r>
-              <w:t xml:space="preserve"> med bane og gate, og deltakerstatistikk til aktivitetsmodulen. Q2 2027.</w:t>
-            </w:r>
-          </w:p>
-          <w:p>
-            <w:pPr>
-              <w:spacing w:before="0" w:after="40"/>
-              <w:ind w:left="284" w:hanging="227"/>
-            </w:pPr>
-            <w:r>
-              <w:t xml:space="preserve">–	</w:t>
-            </w:r>
-            <w:r>
-              <w:rPr>
-                <w:b/>
-                <w:bCs/>
-              </w:rPr>
-              <w:t xml:space="preserve">Eldre gateløpsresultater</w:t>
+              <w:t xml:space="preserve"> med bane og løp, og løpene med i aktivitetsstatistikken. Q2 2027.</w:t>
+            </w:r>
+          </w:p>
+          <w:p>
+            <w:pPr>
+              <w:spacing w:before="0" w:after="40"/>
+              <w:ind w:left="284" w:hanging="227"/>
+            </w:pPr>
+            <w:r>
+              <w:t xml:space="preserve">–	</w:t>
+            </w:r>
+            <w:r>
+              <w:rPr>
+                <w:b/>
+                <w:bCs/>
+              </w:rPr>
+              <w:t xml:space="preserve">Eldre resultater fra løp utenfor bane</w:t>
             </w:r>
             <w:r>
               <w:t xml:space="preserve">, særlig rekorder fra før 2013. Etter kartlegging.</w:t>
@@ -1234,7 +1379,45 @@
               <w:t xml:space="preserve">Avvik:</w:t>
             </w:r>
             <w:r>
-              <w:t xml:space="preserve"> arbeidslisten fra de nattlige kontrollene. Hvert avvik godkjennes som riktig, rettes eller underkjennes, med kommentar og registrering av hvem som gjorde det. Denne delen er ny siden presentasjonen.</w:t>
+              <w:t xml:space="preserve"> arbeidslisten fra de nattlige kontrollene. Hvert avvik godkjennes som riktig, rettes eller underkjennes, med kommentar og registrering av hvem som gjorde det. Mulige rekorder og bestenoteringer legges frem her.</w:t>
+            </w:r>
+          </w:p>
+          <w:p>
+            <w:pPr>
+              <w:spacing w:before="0" w:after="40"/>
+              <w:ind w:left="284" w:hanging="227"/>
+            </w:pPr>
+            <w:r>
+              <w:t xml:space="preserve">–	</w:t>
+            </w:r>
+            <w:r>
+              <w:rPr>
+                <w:b/>
+                <w:bCs/>
+              </w:rPr>
+              <w:t xml:space="preserve">Ikke godkjente resultater:</w:t>
+            </w:r>
+            <w:r>
+              <w:t xml:space="preserve"> resultater som ikke er godkjent, for eksempel på grunn av kort bane, manglende medlemskap i NFIF eller feil i startutstyret, registreres med årsak. De holdes utenfor alle lister og rekorder, men vises med årsak på utøver- og stevnesidene.</w:t>
+            </w:r>
+          </w:p>
+          <w:p>
+            <w:pPr>
+              <w:spacing w:before="0" w:after="40"/>
+              <w:ind w:left="284" w:hanging="227"/>
+            </w:pPr>
+            <w:r>
+              <w:t xml:space="preserve">–	</w:t>
+            </w:r>
+            <w:r>
+              <w:rPr>
+                <w:b/>
+                <w:bCs/>
+              </w:rPr>
+              <w:t xml:space="preserve">Terminliste:</w:t>
+            </w:r>
+            <w:r>
+              <w:t xml:space="preserve"> hvilke arrangementer i terminlisten som mangler resultater, hvor lenge de har manglet, og om arrangøren er purret. En purreliste samler det som mangler per arrangør, med ferdig e-postutkast.</w:t>
             </w:r>
           </w:p>
           <w:p>
@@ -1307,29 +1490,29 @@
                 <w:b/>
                 <w:bCs/>
               </w:rPr>
-              <w:t xml:space="preserve">Terminliste:</w:t>
-            </w:r>
-            <w:r>
-              <w:t xml:space="preserve"> hvilke arrangementer i terminlisten som mangler resultater, hvor lenge de har manglet, og om arrangøren er purret. En purreliste samler det som mangler per arrangør, med ferdig e-postutkast. Denne delen er ny siden presentasjonen.</w:t>
-            </w:r>
-          </w:p>
-          <w:p>
-            <w:pPr>
-              <w:spacing w:before="0" w:after="40"/>
-              <w:ind w:left="284" w:hanging="227"/>
-            </w:pPr>
-            <w:r>
-              <w:t xml:space="preserve">–	</w:t>
-            </w:r>
-            <w:r>
-              <w:rPr>
-                <w:b/>
-                <w:bCs/>
-              </w:rPr>
               <w:t xml:space="preserve">Import:</w:t>
             </w:r>
             <w:r>
-              <w:t xml:space="preserve"> opplasting av resultatlister fra FriRes og Excel, med validering og godkjenningskø før publisering.</w:t>
+              <w:t xml:space="preserve"> opplasting av resultatlister på friidrettens standardmal i Excel, som CSV eller som tekstfil, med godkjenning før publisering. Utøverne kobles automatisk på navn, fødselsår og kjønn, og rader som alt ligger inne, hoppes over. Importen er prøvd på en resultatliste som kom inn til resultater@friidrett.no 17. oktober: alle 48 resultatene og de 15 utøverne ble koblet automatisk.</w:t>
+            </w:r>
+          </w:p>
+          <w:p>
+            <w:pPr>
+              <w:spacing w:before="0" w:after="40"/>
+              <w:ind w:left="284" w:hanging="227"/>
+            </w:pPr>
+            <w:r>
+              <w:t xml:space="preserve">–	</w:t>
+            </w:r>
+            <w:r>
+              <w:rPr>
+                <w:b/>
+                <w:bCs/>
+              </w:rPr>
+              <w:t xml:space="preserve">Brukere og nedlasting:</w:t>
+            </w:r>
+            <w:r>
+              <w:t xml:space="preserve"> oversikt over brukere og roller. Lister kan lastes ned som CSV for Excel, men bare av administratorer, og hver nedlasting logges med hvem, hva og når.</w:t>
             </w:r>
           </w:p>
           <w:p>
@@ -1337,6 +1520,14 @@
               <w:spacing w:before="60" w:after="80"/>
             </w:pPr>
             <w:r>
+              <w:t xml:space="preserve">Avvik, ikke godkjente resultater, terminliste, brukere og nedlasting er nye siden presentasjonen.</w:t>
+            </w:r>
+          </w:p>
+          <w:p>
+            <w:pPr>
+              <w:spacing w:before="60" w:after="80"/>
+            </w:pPr>
+            <w:r>
               <w:t xml:space="preserve">Dette gjenstår:</w:t>
             </w:r>
           </w:p>
@@ -1361,31 +1552,31 @@
               <w:t xml:space="preserve">–	</w:t>
             </w:r>
             <w:r>
-              <w:t xml:space="preserve">Manuell overstyring av kvalitetsnivå, og underkjenning med årsakskode. Desember 2026.</w:t>
-            </w:r>
-          </w:p>
-          <w:p>
-            <w:pPr>
-              <w:spacing w:before="0" w:after="40"/>
-              <w:ind w:left="284" w:hanging="227"/>
-            </w:pPr>
-            <w:r>
-              <w:t xml:space="preserve">–	</w:t>
-            </w:r>
-            <w:r>
-              <w:t xml:space="preserve">Brukere og roller for NFIF og kretsene, med logg over alle endringer. Q1 2027.</w:t>
-            </w:r>
-          </w:p>
-          <w:p>
-            <w:pPr>
-              <w:spacing w:before="0" w:after="40"/>
-              <w:ind w:left="284" w:hanging="227"/>
-            </w:pPr>
-            <w:r>
-              <w:t xml:space="preserve">–	</w:t>
-            </w:r>
-            <w:r>
-              <w:t xml:space="preserve">Administrasjon av gateløp: løyperegister, løp og kobling av løpere. Q1–Q2 2027.</w:t>
+              <w:t xml:space="preserve">Underkjenning og manuell overstyring av kvalitetsnivå direkte i verktøyet. Desember 2026.</w:t>
+            </w:r>
+          </w:p>
+          <w:p>
+            <w:pPr>
+              <w:spacing w:before="0" w:after="40"/>
+              <w:ind w:left="284" w:hanging="227"/>
+            </w:pPr>
+            <w:r>
+              <w:t xml:space="preserve">–	</w:t>
+            </w:r>
+            <w:r>
+              <w:t xml:space="preserve">Roller for NFIF og kretsene, og logg over alle endringer. Q1 2027.</w:t>
+            </w:r>
+          </w:p>
+          <w:p>
+            <w:pPr>
+              <w:spacing w:before="0" w:after="40"/>
+              <w:ind w:left="284" w:hanging="227"/>
+            </w:pPr>
+            <w:r>
+              <w:t xml:space="preserve">–	</w:t>
+            </w:r>
+            <w:r>
+              <w:t xml:space="preserve">Administrasjon av løp utenfor bane: løyperegister, løp og kobling av løpere. Q1–Q2 2027.</w:t>
             </w:r>
           </w:p>
         </w:tc>
@@ -1684,6 +1875,21 @@
               <w:spacing w:before="60" w:after="80"/>
             </w:pPr>
             <w:r>
+              <w:rPr>
+                <w:b/>
+                <w:bCs/>
+              </w:rPr>
+              <w:t xml:space="preserve">Kontroll mot de godkjente mastersrekordene.</w:t>
+            </w:r>
+            <w:r>
+              <w:t xml:space="preserve"> Vi har gått gjennom de offisielle rekordlistene, ute og inne for menn og kvinner, linje for linje mot basen. Av 1 085 rekordlinjer fantes 503 allerede. 551 manglet og er lagt inn. De godkjente rekordene er merket i basen og vises på masterssiden, også der eldre rekorder mangler vindmåling eller er håndtidtatt. Masterssiden viser nå samme rekord som rekordlistene i 912 av 1 004 klasser og øvelser. Resten er samlet i en avviksliste. Omtrent halvparten er nyere resultater som kan være nye rekorder. Resten er blant annet resultater som ikke er godkjent, og feil i eldre data. Disse skal avklares med rekordansvarlig.</w:t>
+            </w:r>
+          </w:p>
+          <w:p>
+            <w:pPr>
+              <w:spacing w:before="60" w:after="80"/>
+            </w:pPr>
+            <w:r>
               <w:t xml:space="preserve">Fordelene med én database:</w:t>
             </w:r>
           </w:p>
@@ -1787,7 +1993,7 @@
               <w:t xml:space="preserve">Mastersklassene har eget regelverk.</w:t>
             </w:r>
             <w:r>
-              <w:t xml:space="preserve"> WMA-reglene for redskap og hekkehøyder legges inn som regler for klassene.</w:t>
+              <w:t xml:space="preserve"> WMA-reglene for redskap og hekkehøyder legges inn som regler for klassene. Særtilfeller er allerede tatt hensyn til, for eksempel at kastøvelsene på innendørsmesterskap regnes som utendørs, slik rekordlistene gjør.</w:t>
             </w:r>
           </w:p>
           <w:p>
@@ -1796,6 +2002,21 @@
             </w:pPr>
             <w:r>
               <w:t xml:space="preserve">Ulempen med én database er at mastersklassene må holdes adskilt i presentasjonen, så seniorlistene ikke blir uoversiktlige. Det er gjort i løsningen.</w:t>
+            </w:r>
+          </w:p>
+          <w:p>
+            <w:pPr>
+              <w:spacing w:before="60" w:after="80"/>
+            </w:pPr>
+            <w:r>
+              <w:rPr>
+                <w:b/>
+                <w:bCs/>
+              </w:rPr>
+              <w:t xml:space="preserve">Mastersmiljøet.</w:t>
+            </w:r>
+            <w:r>
+              <w:t xml:space="preserve"> Blir vi valgt, tar vi straks kontakt med mastersmiljøet. Vi vil finne ut hva de ønsker seg, hvordan statistikk og rekorder bør presenteres, og om det er noe spesifikt de savner i dag. Løsningen tilpasses etter det.</w:t>
             </w:r>
           </w:p>
         </w:tc>
@@ -2107,7 +2328,7 @@
               <w:t xml:space="preserve">Resultatlister som kommer inn til Norsk Friidrett.</w:t>
             </w:r>
             <w:r>
-              <w:t xml:space="preserve"> De fleste kommer gjennom iSonen, resten som filer fra FriRes og LiveRes, OpenTrack og tidtakerne. Plattformen tar imot alle, og alle går gjennom de samme kontrollene.</w:t>
+              <w:t xml:space="preserve"> De fleste kommer gjennom iSonen, resten fra FriRes og LiveRes, OpenTrack og tidtakerne. Plattformen tar imot alle, og alle går gjennom de samme kontrollene. Lister som sendes på e-post til resultater@friidrett.no, kan legges inn samme dag. Når stevnet senere kommer gjennom den ordinære importen, kjennes radene igjen, så det ikke blir dubletter.</w:t>
             </w:r>
           </w:p>
           <w:p>
@@ -2149,6 +2370,21 @@
               <w:spacing w:before="60" w:after="80"/>
             </w:pPr>
             <w:r>
+              <w:rPr>
+                <w:b/>
+                <w:bCs/>
+              </w:rPr>
+              <w:t xml:space="preserve">Avtaler med leverandørene.</w:t>
+            </w:r>
+            <w:r>
+              <w:t xml:space="preserve"> Vi har ingen formell rolle for Norsk Friidrett i dag, og har derfor ikke kunnet forhandle om API-er eller diskutere integrasjoner med leverandørene av resultater. Blir vi valgt, tar vi straks kontakt med iSonen, OpenTrack, FriRes/LiveRes, EQ Timing og Ultimate Sport Service, for å sikre at resultatene kan listeføres umiddelbart etter hvert stevne. Vi har testet dataformatene der det har vært mulig, og vet at importen fungerer. De endelige løsningene må likevel avtales med hver leverandør.</w:t>
+            </w:r>
+          </w:p>
+          <w:p>
+            <w:pPr>
+              <w:spacing w:before="60" w:after="80"/>
+            </w:pPr>
+            <w:r>
               <w:t xml:space="preserve">Status for de enkelte systemene:</w:t>
             </w:r>
           </w:p>
@@ -2168,7 +2404,7 @@
               <w:t xml:space="preserve">iSonen:</w:t>
             </w:r>
             <w:r>
-              <w:t xml:space="preserve"> API-tilgang forutsetter avtale med NFIF og Buypass, og vi tar kontakt om dette etter en eventuell tildeling. Frem til da brukes den åpne terminlisten til kontrollen over. Q1 2027, etter at tilgang er gitt.</w:t>
+              <w:t xml:space="preserve"> API-tilgang forutsetter avtale med NFIF og Buypass. Frem til da brukes den åpne terminlisten, med arrangement, arrangør og krets, til kontrollen over. Resultatoverføring fra Q1 2027, etter at tilgang er gitt.</w:t>
             </w:r>
           </w:p>
           <w:p>
@@ -2187,7 +2423,7 @@
               <w:t xml:space="preserve">FriRes og LiveRes:</w:t>
             </w:r>
             <w:r>
-              <w:t xml:space="preserve"> vi har direkte tilgang til LiveRes' datastrøm, avtalt med utvikleren. Den gir stevnelisten og fullstendige resultatlister per stevnedag, med FriSys-id, fødselsdato, klubb, vind og hvert forsøk. Importen kan bygges nå.</w:t>
+              <w:t xml:space="preserve"> vi har fått tilgang til LiveRes' datastrøm fra utvikleren, og har testet formatet. Den gir stevnelisten og fullstendige resultatlister per stevnedag, med FriSys-id, fødselsdato, klubb, vind og hvert forsøk. Importen bygges når bruken er avtalt.</w:t>
             </w:r>
           </w:p>
           <w:p>
@@ -2206,7 +2442,7 @@
               <w:t xml:space="preserve">OpenTrack:</w:t>
             </w:r>
             <w:r>
-              <w:t xml:space="preserve"> ikke utviklet. OpenTrack har et åpent API, så integrasjonen avhenger ikke av tilrettelegging. Q1–Q2 2027.</w:t>
+              <w:t xml:space="preserve"> ikke utviklet, og ikke testet ennå. OpenTrack har et åpent API, så integrasjonen bør ikke avhenge av særskilt tilrettelegging. Q1–Q2 2027.</w:t>
             </w:r>
           </w:p>
           <w:p>
@@ -2225,7 +2461,7 @@
               <w:t xml:space="preserve">EQ Timing:</w:t>
             </w:r>
             <w:r>
-              <w:t xml:space="preserve"> fungerer som prototype, jf. svar 1.2. Importen bruker EQ Timings åpne resultattjeneste. For varig drift ønsker vi en avtale om grensesnittet og varsling ved endringer.</w:t>
+              <w:t xml:space="preserve"> fungerer. Importen bruker EQ Timings åpne resultattjeneste og er testet på hele 2026, jf. svar 1.2. For varig drift ønsker vi en avtale om grensesnittet og varsling ved endringer.</w:t>
             </w:r>
           </w:p>
           <w:p>
@@ -2244,7 +2480,7 @@
               <w:t xml:space="preserve">Ultimate Sport Service:</w:t>
             </w:r>
             <w:r>
-              <w:t xml:space="preserve"> ikke kartlagt. Avhenger av tilgang fra leverandøren.</w:t>
+              <w:t xml:space="preserve"> formatet er testet, og importen er bygget, med netto- og bruttotid. Hvilke løp og resultater som skal inn, avklares med NFIF (svar 1.2), og grensesnittet avtales med leverandøren.</w:t>
             </w:r>
           </w:p>
           <w:p>
@@ -2252,7 +2488,7 @@
               <w:spacing w:before="60" w:after="80"/>
             </w:pPr>
             <w:r>
-              <w:t xml:space="preserve">Dersom API-tilgang ikke blir gitt, stopper ikke løsningen opp. Resultatlister kan lastes opp som fil (CSV, Excel eller FriRes) i administrasjonsverktøyet, og de går gjennom de samme kontrollene. Offentlige resultatsider kan hentes der tidtakeren tillater det. Det gir mer manuelt arbeid, men terminlistekontrollen sikrer at ingenting faller ut i det stille. Uten lisensregisteret settes kvalitetsnivået ut fra stevnenivå og tidtaking, og det overstyres manuelt der det trengs.</w:t>
+              <w:t xml:space="preserve">Dersom API-tilgang ikke blir gitt, stopper ikke løsningen opp. Resultatlister kan lastes opp som fil (CSV, Excel eller tekstfil) i administrasjonsverktøyet, og de går gjennom de samme kontrollene. Offentlige resultatsider kan hentes der tidtakeren tillater det. Det gir mer manuelt arbeid, men terminlistekontrollen sikrer at ingenting faller ut i det stille. Uten lisensregisteret settes kvalitetsnivået ut fra stevnenivå og tidtaking, og det overstyres manuelt der det trengs.</w:t>
             </w:r>
           </w:p>
         </w:tc>
@@ -2551,6 +2787,14 @@
               <w:spacing w:before="60" w:after="80"/>
             </w:pPr>
             <w:r>
+              <w:t xml:space="preserve">Plattformen kontrollerer alle nye resultater hver natt: tider som er umulige for distansen, mulige rekorder og bestenoteringer, uvanlig store forbedringer, og manglende vind, kjønn eller fødselsår. Avvikene legges i arbeidslisten i administrasjonsverktøyet, og vi behandler dem fortløpende i sesongen.</w:t>
+            </w:r>
+          </w:p>
+          <w:p>
+            <w:pPr>
+              <w:spacing w:before="60" w:after="80"/>
+            </w:pPr>
+            <w:r>
               <w:t xml:space="preserve">Innenfor den årlige driftsprisen:</w:t>
             </w:r>
           </w:p>
@@ -2575,6 +2819,18 @@
               <w:t xml:space="preserve">–	</w:t>
             </w:r>
             <w:r>
+              <w:t xml:space="preserve">Resultater registrert på feil utøver, for eksempel når flere har samme navn.</w:t>
+            </w:r>
+          </w:p>
+          <w:p>
+            <w:pPr>
+              <w:spacing w:before="0" w:after="40"/>
+              <w:ind w:left="284" w:hanging="227"/>
+            </w:pPr>
+            <w:r>
+              <w:t xml:space="preserve">–	</w:t>
+            </w:r>
+            <w:r>
               <w:t xml:space="preserve">Dubletter av resultater, stevner og utøvere, og sammenslåing av utøvere.</w:t>
             </w:r>
           </w:p>
@@ -2655,7 +2911,7 @@
               <w:t xml:space="preserve">–	</w:t>
             </w:r>
             <w:r>
-              <w:t xml:space="preserve">Underkjenning av stevner eller resultater, med årsakskode.</w:t>
+              <w:t xml:space="preserve">Underkjenning av stevner eller resultater. Når NFIF har avgjort saken, registrerer vi underkjenningen med årsak, og resultatet holdes utenfor lister og rekorder.</w:t>
             </w:r>
           </w:p>
           <w:p>
@@ -2675,7 +2931,45 @@
               <w:spacing w:before="60" w:after="80"/>
             </w:pPr>
             <w:r>
-              <w:t xml:space="preserve">Faktureres særskilt, etter timepris og bare etter forhåndsgodkjenning:</w:t>
+              <w:t xml:space="preserve">Faktureres særskilt. Dette prises i hvert enkelt tilfelle og avtales på forhånd:</w:t>
+            </w:r>
+          </w:p>
+          <w:p>
+            <w:pPr>
+              <w:spacing w:before="0" w:after="40"/>
+              <w:ind w:left="284" w:hanging="227"/>
+            </w:pPr>
+            <w:r>
+              <w:t xml:space="preserve">–	</w:t>
+            </w:r>
+            <w:r>
+              <w:rPr>
+                <w:b/>
+                <w:bCs/>
+              </w:rPr>
+              <w:t xml:space="preserve">Kretsenes egne statistikker.</w:t>
+            </w:r>
+            <w:r>
+              <w:t xml:space="preserve"> Flere kretser har utvidede kretsstatistikker, blant annet Oslo og Akershus, som har en omfattende statistikk. Mye av dette er historisk statistikk som ikke ligger i basen. Den finnes i krevende formater og er av ulik kvalitet, og en integrering krever mye tid, særlig til kvalitetssikring.</w:t>
+            </w:r>
+          </w:p>
+          <w:p>
+            <w:pPr>
+              <w:spacing w:before="0" w:after="40"/>
+              <w:ind w:left="284" w:hanging="227"/>
+            </w:pPr>
+            <w:r>
+              <w:t xml:space="preserve">–	</w:t>
+            </w:r>
+            <w:r>
+              <w:rPr>
+                <w:b/>
+                <w:bCs/>
+              </w:rPr>
+              <w:t xml:space="preserve">Historisk statistikk fra forbundet.</w:t>
+            </w:r>
+            <w:r>
+              <w:t xml:space="preserve"> Også her er det stor forskjell i kvalitet og format, og arbeidet kan være tidkrevende.</w:t>
             </w:r>
           </w:p>
           <w:p>
@@ -3017,7 +3311,7 @@
               <w:t xml:space="preserve">–	</w:t>
             </w:r>
             <w:r>
-              <w:t xml:space="preserve">Utøverprofiler, stevnesider, og klubbsider med klubbstatistikk og klubbrekorder.</w:t>
+              <w:t xml:space="preserve">Utøverprofiler, klubbsider med klubbstatistikk og klubbrekorder, og stevnesider med arrangør, arrangementstype og krets.</w:t>
             </w:r>
           </w:p>
           <w:p>
@@ -3041,19 +3335,43 @@
               <w:t xml:space="preserve">–	</w:t>
             </w:r>
             <w:r>
-              <w:t xml:space="preserve">Aktivitet og deltakelse, med eksport til Excel.</w:t>
-            </w:r>
-          </w:p>
-          <w:p>
-            <w:pPr>
-              <w:spacing w:before="0" w:after="40"/>
-              <w:ind w:left="284" w:hanging="227"/>
-            </w:pPr>
-            <w:r>
-              <w:t xml:space="preserve">–	</w:t>
-            </w:r>
-            <w:r>
-              <w:t xml:space="preserve">Masterstatistikk per femårsklasse.</w:t>
+              <w:t xml:space="preserve">Masterstatistikk per femårsklasse, kontrollert mot de godkjente mastersrekordene (svar 1.4).</w:t>
+            </w:r>
+          </w:p>
+          <w:p>
+            <w:pPr>
+              <w:spacing w:before="0" w:after="40"/>
+              <w:ind w:left="284" w:hanging="227"/>
+            </w:pPr>
+            <w:r>
+              <w:t xml:space="preserve">–	</w:t>
+            </w:r>
+            <w:r>
+              <w:t xml:space="preserve">Aktivitet og deltakelse.</w:t>
+            </w:r>
+          </w:p>
+          <w:p>
+            <w:pPr>
+              <w:spacing w:before="0" w:after="40"/>
+              <w:ind w:left="284" w:hanging="227"/>
+            </w:pPr>
+            <w:r>
+              <w:t xml:space="preserve">–	</w:t>
+            </w:r>
+            <w:r>
+              <w:t xml:space="preserve">Ikke godkjente resultater registrert med årsak, holdt utenfor lister og rekorder.</w:t>
+            </w:r>
+          </w:p>
+          <w:p>
+            <w:pPr>
+              <w:spacing w:before="0" w:after="40"/>
+              <w:ind w:left="284" w:hanging="227"/>
+            </w:pPr>
+            <w:r>
+              <w:t xml:space="preserve">–	</w:t>
+            </w:r>
+            <w:r>
+              <w:t xml:space="preserve">Eksport til Excel og CSV fra årslister, alle-tiders-lister, klubb- og stevnesider og aktivitetssiden, for administratorer og med logg.</w:t>
             </w:r>
           </w:p>
           <w:p>
@@ -3077,7 +3395,19 @@
               <w:t xml:space="preserve">–	</w:t>
             </w:r>
             <w:r>
-              <w:t xml:space="preserve">Administrasjonsverktøy for utøvere, resultater, stevner, klubber, import og avvik.</w:t>
+              <w:t xml:space="preserve">Administrasjonsverktøy for avvik, terminliste, utøvere, resultater, stevner, klubber, import og brukere.</w:t>
+            </w:r>
+          </w:p>
+          <w:p>
+            <w:pPr>
+              <w:spacing w:before="0" w:after="40"/>
+              <w:ind w:left="284" w:hanging="227"/>
+            </w:pPr>
+            <w:r>
+              <w:t xml:space="preserve">–	</w:t>
+            </w:r>
+            <w:r>
+              <w:t xml:space="preserve">Første versjon av løp utenfor bane, med import fra EQ Timing (svar 1.2).</w:t>
             </w:r>
           </w:p>
           <w:p>
@@ -3113,31 +3443,19 @@
               <w:t xml:space="preserve">–	</w:t>
             </w:r>
             <w:r>
-              <w:t xml:space="preserve">Dokumentert API, og eksport til Excel og CSV fra alle lister.</w:t>
-            </w:r>
-          </w:p>
-          <w:p>
-            <w:pPr>
-              <w:spacing w:before="0" w:after="40"/>
-              <w:ind w:left="284" w:hanging="227"/>
-            </w:pPr>
-            <w:r>
-              <w:t xml:space="preserve">–	</w:t>
-            </w:r>
-            <w:r>
-              <w:t xml:space="preserve">Kretsstatistikk.</w:t>
-            </w:r>
-          </w:p>
-          <w:p>
-            <w:pPr>
-              <w:spacing w:before="0" w:after="40"/>
-              <w:ind w:left="284" w:hanging="227"/>
-            </w:pPr>
-            <w:r>
-              <w:t xml:space="preserve">–	</w:t>
-            </w:r>
-            <w:r>
-              <w:t xml:space="preserve">Rekordgodkjenning og underkjenning med årsakskode i administrasjonsverktøyet.</w:t>
+              <w:t xml:space="preserve">Dokumentert API for godkjente brukere.</w:t>
+            </w:r>
+          </w:p>
+          <w:p>
+            <w:pPr>
+              <w:spacing w:before="0" w:after="40"/>
+              <w:ind w:left="284" w:hanging="227"/>
+            </w:pPr>
+            <w:r>
+              <w:t xml:space="preserve">–	</w:t>
+            </w:r>
+            <w:r>
+              <w:t xml:space="preserve">Rekordgodkjenning og underkjenning direkte i administrasjonsverktøyet.</w:t>
             </w:r>
           </w:p>
           <w:p>
@@ -3161,7 +3479,7 @@
               <w:t xml:space="preserve">–	</w:t>
             </w:r>
             <w:r>
-              <w:t xml:space="preserve">Innsamling av resultatlister fra LiveRes og tidtakerne, og første versjon av søket etter norske resultater i utlandet.</w:t>
+              <w:t xml:space="preserve">Første versjon av søket etter norske resultater i utlandet.</w:t>
             </w:r>
           </w:p>
           <w:p>
@@ -3197,31 +3515,31 @@
               <w:t xml:space="preserve">–	</w:t>
             </w:r>
             <w:r>
-              <w:t xml:space="preserve">Integrasjoner, med iSonen etter avtale, jf. svar 1.5. Q1–Q3.</w:t>
-            </w:r>
-          </w:p>
-          <w:p>
-            <w:pPr>
-              <w:spacing w:before="0" w:after="40"/>
-              <w:ind w:left="284" w:hanging="227"/>
-            </w:pPr>
-            <w:r>
-              <w:t xml:space="preserve">–	</w:t>
-            </w:r>
-            <w:r>
-              <w:t xml:space="preserve">Brukere og roller for kretsene, og logg over endringer. Q1.</w:t>
-            </w:r>
-          </w:p>
-          <w:p>
-            <w:pPr>
-              <w:spacing w:before="0" w:after="40"/>
-              <w:ind w:left="284" w:hanging="227"/>
-            </w:pPr>
-            <w:r>
-              <w:t xml:space="preserve">–	</w:t>
-            </w:r>
-            <w:r>
-              <w:t xml:space="preserve">Eldre statistikk, etter NFIFs valg.</w:t>
+              <w:t xml:space="preserve">Integrasjoner, jf. svar 1.5. Q1–Q3.</w:t>
+            </w:r>
+          </w:p>
+          <w:p>
+            <w:pPr>
+              <w:spacing w:before="0" w:after="40"/>
+              <w:ind w:left="284" w:hanging="227"/>
+            </w:pPr>
+            <w:r>
+              <w:t xml:space="preserve">–	</w:t>
+            </w:r>
+            <w:r>
+              <w:t xml:space="preserve">Roller for NFIF og kretsene, og logg over alle endringer. Q1.</w:t>
+            </w:r>
+          </w:p>
+          <w:p>
+            <w:pPr>
+              <w:spacing w:before="0" w:after="40"/>
+              <w:ind w:left="284" w:hanging="227"/>
+            </w:pPr>
+            <w:r>
+              <w:t xml:space="preserve">–	</w:t>
+            </w:r>
+            <w:r>
+              <w:t xml:space="preserve">Eldre statistikk og kretsenes statistikker, etter NFIFs valg (svar 1.6).</w:t>
             </w:r>
           </w:p>
           <w:p>
@@ -3245,6 +3563,18 @@
               <w:t xml:space="preserve">–	</w:t>
             </w:r>
             <w:r>
+              <w:t xml:space="preserve">Kretsstatistikk: klubbenes kretstilhørighet fra NFIF. Når den foreligger, kan kretsstatistikken være på plass i løpet av få uker.</w:t>
+            </w:r>
+          </w:p>
+          <w:p>
+            <w:pPr>
+              <w:spacing w:before="0" w:after="40"/>
+              <w:ind w:left="284" w:hanging="227"/>
+            </w:pPr>
+            <w:r>
+              <w:t xml:space="preserve">–	</w:t>
+            </w:r>
+            <w:r>
               <w:t xml:space="preserve">Maskinelt kvalitetsnivå: tilgang til lisensregisteret fra NFIF og Buypass. Terminlisten er allerede i bruk.</w:t>
             </w:r>
           </w:p>
@@ -3257,19 +3587,19 @@
               <w:t xml:space="preserve">–	</w:t>
             </w:r>
             <w:r>
-              <w:t xml:space="preserve">Kretsstatistikk: klubbenes kretstilhørighet fra NFIF.</w:t>
-            </w:r>
-          </w:p>
-          <w:p>
-            <w:pPr>
-              <w:spacing w:before="0" w:after="40"/>
-              <w:ind w:left="284" w:hanging="227"/>
-            </w:pPr>
-            <w:r>
-              <w:t xml:space="preserve">–	</w:t>
-            </w:r>
-            <w:r>
-              <w:t xml:space="preserve">Integrasjoner mot iSonen, LiveRes og Ultimate Sport Service: tilgang fra leverandørene.</w:t>
+              <w:t xml:space="preserve">Løp utenfor bane: NFIFs avklaring av hvilke resultater som skal inn i statistikken (svar 1.2).</w:t>
+            </w:r>
+          </w:p>
+          <w:p>
+            <w:pPr>
+              <w:spacing w:before="0" w:after="40"/>
+              <w:ind w:left="284" w:hanging="227"/>
+            </w:pPr>
+            <w:r>
+              <w:t xml:space="preserve">–	</w:t>
+            </w:r>
+            <w:r>
+              <w:t xml:space="preserve">Integrasjoner mot iSonen, FriRes/LiveRes, OpenTrack og Ultimate Sport Service: avtale og tilgang fra leverandørene (svar 1.5).</w:t>
             </w:r>
           </w:p>
           <w:p>
@@ -3665,67 +3995,79 @@
                 <w:b/>
                 <w:bCs/>
               </w:rPr>
-              <w:t xml:space="preserve">Tilgang til data, dokumentasjon og videre drift:</w:t>
-            </w:r>
-          </w:p>
-          <w:p>
-            <w:pPr>
-              <w:spacing w:before="0" w:after="40"/>
-              <w:ind w:left="284" w:hanging="227"/>
-            </w:pPr>
-            <w:r>
-              <w:t xml:space="preserve">–	</w:t>
-            </w:r>
-            <w:r>
-              <w:t xml:space="preserve">NFIF eier alle data og har full eksportrett når som helst, uten gebyr.</w:t>
-            </w:r>
-          </w:p>
-          <w:p>
-            <w:pPr>
-              <w:spacing w:before="0" w:after="40"/>
-              <w:ind w:left="284" w:hanging="227"/>
-            </w:pPr>
-            <w:r>
-              <w:t xml:space="preserve">–	</w:t>
-            </w:r>
-            <w:r>
-              <w:t xml:space="preserve">Kildekode og databasestruktur deponeres hos tredjepart (escrow).</w:t>
-            </w:r>
-          </w:p>
-          <w:p>
-            <w:pPr>
-              <w:spacing w:before="0" w:after="40"/>
-              <w:ind w:left="284" w:hanging="227"/>
-            </w:pPr>
-            <w:r>
-              <w:t xml:space="preserve">–	</w:t>
-            </w:r>
-            <w:r>
-              <w:t xml:space="preserve">Exit-klausul: ved opphør overleveres kildekode, komplette data og driftsdokumentasjon vederlagsfritt, uansett årsak og uansett hvem som sier opp.</w:t>
-            </w:r>
-          </w:p>
-          <w:p>
-            <w:pPr>
-              <w:spacing w:before="0" w:after="40"/>
-              <w:ind w:left="284" w:hanging="227"/>
-            </w:pPr>
-            <w:r>
-              <w:t xml:space="preserve">–	</w:t>
-            </w:r>
-            <w:r>
-              <w:t xml:space="preserve">Vi tilbyr at kontoene for database og drift opprettes i NFIFs navn, med oss som driftsleverandør. Da har NFIF tilgang til alt til enhver tid, også uten oss.</w:t>
-            </w:r>
-          </w:p>
-          <w:p>
-            <w:pPr>
-              <w:spacing w:before="0" w:after="40"/>
-              <w:ind w:left="284" w:hanging="227"/>
-            </w:pPr>
-            <w:r>
-              <w:t xml:space="preserve">–	</w:t>
-            </w:r>
-            <w:r>
-              <w:t xml:space="preserve">Løsningen bygger på standard teknologi (PostgreSQL, Next.js og Python) som enhver kompetent leverandør kan overta.</w:t>
+              <w:t xml:space="preserve">Tilgang til data, dokumentasjon og videre drift.</w:t>
+            </w:r>
+            <w:r>
+              <w:t xml:space="preserve"> Med den reduserte oppstartsprisen (svar 3.1) justerer vi også exit-klausulen i tilbudets kapittel 11. Den skiller nå mellom dataene, som er NFIFs, og nettstedet og programvaren som presenterer dem, som er Athlete Mindset AS':</w:t>
+            </w:r>
+          </w:p>
+          <w:p>
+            <w:pPr>
+              <w:spacing w:before="0" w:after="40"/>
+              <w:ind w:left="284" w:hanging="227"/>
+            </w:pPr>
+            <w:r>
+              <w:t xml:space="preserve">–	</w:t>
+            </w:r>
+            <w:r>
+              <w:rPr>
+                <w:b/>
+                <w:bCs/>
+              </w:rPr>
+              <w:t xml:space="preserve">Data.</w:t>
+            </w:r>
+            <w:r>
+              <w:t xml:space="preserve"> NFIF eier alle data og har full eksportrett når som helst, i åpne formater og uten gebyr, slik kravspesifikasjonens punkt 4 krever.</w:t>
+            </w:r>
+          </w:p>
+          <w:p>
+            <w:pPr>
+              <w:spacing w:before="0" w:after="40"/>
+              <w:ind w:left="284" w:hanging="227"/>
+            </w:pPr>
+            <w:r>
+              <w:t xml:space="preserve">–	</w:t>
+            </w:r>
+            <w:r>
+              <w:rPr>
+                <w:b/>
+                <w:bCs/>
+              </w:rPr>
+              <w:t xml:space="preserve">Ved opphør av avtalen,</w:t>
+            </w:r>
+            <w:r>
+              <w:t xml:space="preserve"> uansett årsak, overleveres komplette data med dokumentasjon av datamodellen, slik at de kan tas i bruk i en annen løsning. Nettstedet og programvaren følger ikke med. Vi bistår ved overgangen etter nærmere avtale.</w:t>
+            </w:r>
+          </w:p>
+          <w:p>
+            <w:pPr>
+              <w:spacing w:before="0" w:after="40"/>
+              <w:ind w:left="284" w:hanging="227"/>
+            </w:pPr>
+            <w:r>
+              <w:t xml:space="preserve">–	</w:t>
+            </w:r>
+            <w:r>
+              <w:rPr>
+                <w:b/>
+                <w:bCs/>
+              </w:rPr>
+              <w:t xml:space="preserve">Hvis Athlete Mindset AS ikke lenger kan levere,</w:t>
+            </w:r>
+            <w:r>
+              <w:t xml:space="preserve"> for eksempel ved konkurs eller avvikling, utleveres kildekode og driftsdokumentasjon fra deponi hos tredjepart, slik at driften kan videreføres.</w:t>
+            </w:r>
+          </w:p>
+          <w:p>
+            <w:pPr>
+              <w:spacing w:before="0" w:after="40"/>
+              <w:ind w:left="284" w:hanging="227"/>
+            </w:pPr>
+            <w:r>
+              <w:t xml:space="preserve">–	</w:t>
+            </w:r>
+            <w:r>
+              <w:t xml:space="preserve">Løsningen bygger på standard teknologi (PostgreSQL, Next.js og Python).</w:t>
             </w:r>
           </w:p>
           <w:p>
@@ -4070,19 +4412,38 @@
               <w:spacing w:before="60" w:after="80"/>
             </w:pPr>
             <w:r>
-              <w:t xml:space="preserve">Kostnaden var drevet av tre poster: verdien av plattformen og datagrunnlaget som overføres, masters og eldre statistikk. Slik er postene justert:</w:t>
-            </w:r>
-          </w:p>
-          <w:p>
-            <w:pPr>
-              <w:spacing w:before="0" w:after="40"/>
-              <w:ind w:left="284" w:hanging="227"/>
-            </w:pPr>
-            <w:r>
-              <w:t xml:space="preserve">–	</w:t>
-            </w:r>
-            <w:r>
-              <w:t xml:space="preserve">Plattformen og datagrunnlaget som overføres: fra 250 000 kr til </w:t>
+              <w:rPr>
+                <w:b/>
+                <w:bCs/>
+              </w:rPr>
+              <w:t xml:space="preserve">Hva oppstartsprisen er.</w:t>
+            </w:r>
+            <w:r>
+              <w:t xml:space="preserve"> Oppstartsprisen er i hovedsak betaling for en løsning som allerede er utviklet. NFIF får fra første dag en plattform i drift: utøver-, klubb- og stevnesider, årslister, alle-tiders-lister og rekorder, masterstatistikk, NM-kvalifisering, aktivitetsstatistikk, automatiske kontroller og et administrasjonsverktøy. Bak dette ligger svært mange timers arbeid, som vi har tatt på egen risiko. At deler av løsningen, som masterstatistikken, allerede er ferdig, gjør den ikke mindre verdt.</w:t>
+            </w:r>
+          </w:p>
+          <w:p>
+            <w:pPr>
+              <w:spacing w:before="60" w:after="80"/>
+            </w:pPr>
+            <w:r>
+              <w:rPr>
+                <w:b/>
+                <w:bCs/>
+              </w:rPr>
+              <w:t xml:space="preserve">Hva som driver kostnaden:</w:t>
+            </w:r>
+          </w:p>
+          <w:p>
+            <w:pPr>
+              <w:spacing w:before="0" w:after="40"/>
+              <w:ind w:left="284" w:hanging="227"/>
+            </w:pPr>
+            <w:r>
+              <w:t xml:space="preserve">–	</w:t>
+            </w:r>
+            <w:r>
+              <w:t xml:space="preserve">Den ferdig utviklede løsningen, inkludert masterstatistikken, og arbeidet med å hente inn, kontrollere og strukturere dataene: </w:t>
             </w:r>
             <w:r>
               <w:rPr>
@@ -4103,34 +4464,49 @@
               <w:t xml:space="preserve">–	</w:t>
             </w:r>
             <w:r>
-              <w:t xml:space="preserve">Masters: fra 100 000 kr til </w:t>
+              <w:t xml:space="preserve">Det som gjenstår før 1. januar 2027: dokumentert API </w:t>
             </w:r>
             <w:r>
               <w:rPr>
                 <w:highlight w:val="yellow"/>
               </w:rPr>
-              <w:t xml:space="preserve">0 kr</w:t>
-            </w:r>
-            <w:r>
-              <w:t xml:space="preserve">. Masterstatistikken er bygget og i drift, jf. svar 1.4.</w:t>
-            </w:r>
-          </w:p>
-          <w:p>
-            <w:pPr>
-              <w:spacing w:before="0" w:after="40"/>
-              <w:ind w:left="284" w:hanging="227"/>
-            </w:pPr>
-            <w:r>
-              <w:t xml:space="preserve">–	</w:t>
-            </w:r>
-            <w:r>
-              <w:t xml:space="preserve">Opphenting av eldre statistikk: tas ut av fastprisen og tilbys som valgfritt tillegg til </w:t>
+              <w:t xml:space="preserve">80 000 kr</w:t>
+            </w:r>
+            <w:r>
+              <w:t xml:space="preserve">, kvalitetsnivå for resultater </w:t>
             </w:r>
             <w:r>
               <w:rPr>
                 <w:highlight w:val="yellow"/>
               </w:rPr>
-              <w:t xml:space="preserve">100 000 kr</w:t>
+              <w:t xml:space="preserve">50 000 kr</w:t>
+            </w:r>
+            <w:r>
+              <w:t xml:space="preserve">, dokumentasjon, personvernvurdering og databehandleravtale </w:t>
+            </w:r>
+            <w:r>
+              <w:rPr>
+                <w:highlight w:val="yellow"/>
+              </w:rPr>
+              <w:t xml:space="preserve">40 000 kr</w:t>
+            </w:r>
+            <w:r>
+              <w:t xml:space="preserve">, og kretsstatistikk </w:t>
+            </w:r>
+            <w:r>
+              <w:rPr>
+                <w:highlight w:val="yellow"/>
+              </w:rPr>
+              <w:t xml:space="preserve">30 000 kr</w:t>
+            </w:r>
+            <w:r>
+              <w:t xml:space="preserve">. Til sammen </w:t>
+            </w:r>
+            <w:r>
+              <w:rPr>
+                <w:highlight w:val="yellow"/>
+              </w:rPr>
+              <w:t xml:space="preserve">200 000 kr</w:t>
             </w:r>
             <w:r>
               <w:t xml:space="preserve">.</w:t>
@@ -4138,74 +4514,34 @@
           </w:p>
           <w:p>
             <w:pPr>
-              <w:spacing w:before="0" w:after="40"/>
-              <w:ind w:left="284" w:hanging="227"/>
-            </w:pPr>
-            <w:r>
-              <w:t xml:space="preserve">–	</w:t>
-            </w:r>
-            <w:r>
-              <w:t xml:space="preserve">Dokumentert API og eksport: fra 100 000 kr til </w:t>
+              <w:spacing w:before="60" w:after="80"/>
+            </w:pPr>
+            <w:r>
+              <w:rPr>
+                <w:b/>
+                <w:bCs/>
+              </w:rPr>
+              <w:t xml:space="preserve">Hva vi har justert.</w:t>
+            </w:r>
+            <w:r>
+              <w:t xml:space="preserve"> Vi har satt ned prisen for den ferdige løsningen betydelig, fordi vi ønsker et langsiktig samarbeid med NFIF. I tillegg er omfanget justert: opphenting av eldre statistikk er tatt ut av fastprisen. Kvalitet og format varierer mye mellom kildene, så dette prises i hvert enkelt tilfelle, jf. svar 1.6.</w:t>
+            </w:r>
+          </w:p>
+          <w:p>
+            <w:pPr>
+              <w:spacing w:before="60" w:after="80"/>
+            </w:pPr>
+            <w:r>
+              <w:t xml:space="preserve">Årlig drift av banestatistikken er uendret, </w:t>
             </w:r>
             <w:r>
               <w:rPr>
                 <w:highlight w:val="yellow"/>
               </w:rPr>
-              <w:t xml:space="preserve">80 000 kr</w:t>
-            </w:r>
-            <w:r>
-              <w:t xml:space="preserve">.</w:t>
-            </w:r>
-          </w:p>
-          <w:p>
-            <w:pPr>
-              <w:spacing w:before="0" w:after="40"/>
-              <w:ind w:left="284" w:hanging="227"/>
-            </w:pPr>
-            <w:r>
-              <w:t xml:space="preserve">–	</w:t>
-            </w:r>
-            <w:r>
-              <w:t xml:space="preserve">Dokumentasjon, personvernvurdering og databehandleravtale: fra 80 000 kr til </w:t>
-            </w:r>
-            <w:r>
-              <w:rPr>
-                <w:highlight w:val="yellow"/>
-              </w:rPr>
-              <w:t xml:space="preserve">40 000 kr</w:t>
-            </w:r>
-            <w:r>
-              <w:t xml:space="preserve">.</w:t>
-            </w:r>
-          </w:p>
-          <w:p>
-            <w:pPr>
-              <w:spacing w:before="0" w:after="40"/>
-              <w:ind w:left="284" w:hanging="227"/>
-            </w:pPr>
-            <w:r>
-              <w:t xml:space="preserve">–	</w:t>
-            </w:r>
-            <w:r>
-              <w:t xml:space="preserve">Kvalitetsnivå for resultater (</w:t>
-            </w:r>
-            <w:r>
-              <w:rPr>
-                <w:highlight w:val="yellow"/>
-              </w:rPr>
-              <w:t xml:space="preserve">50 000 kr</w:t>
-            </w:r>
-            <w:r>
-              <w:t xml:space="preserve">) og kretsstatistikk (</w:t>
-            </w:r>
-            <w:r>
-              <w:rPr>
-                <w:highlight w:val="yellow"/>
-              </w:rPr>
-              <w:t xml:space="preserve">30 000 kr</w:t>
-            </w:r>
-            <w:r>
-              <w:t xml:space="preserve">) er uendret.</w:t>
+              <w:t xml:space="preserve">300 000 kr</w:t>
+            </w:r>
+            <w:r>
+              <w:t xml:space="preserve"> per år. Den omfatter også behandlingen av avvik, jf. svar 1.6.</w:t>
             </w:r>
           </w:p>
           <w:p>
@@ -4213,24 +4549,7 @@
               <w:spacing w:before="60" w:after="80"/>
             </w:pPr>
             <w:r>
-              <w:t xml:space="preserve">Årlig drift av banestatistikken er uendret, </w:t>
-            </w:r>
-            <w:r>
-              <w:rPr>
-                <w:highlight w:val="yellow"/>
-              </w:rPr>
-              <w:t xml:space="preserve">300 000 kr</w:t>
-            </w:r>
-            <w:r>
-              <w:t xml:space="preserve"> per år. Den omfatter også behandlingen av avvik, jf. svar 1.6.</w:t>
-            </w:r>
-          </w:p>
-          <w:p>
-            <w:pPr>
-              <w:spacing w:before="60" w:after="80"/>
-            </w:pPr>
-            <w:r>
-              <w:t xml:space="preserve">Ønsker NFIF lavest mulig oppstartskostnad, kan overføringen av plattformen fordeles på driftsprisen, med </w:t>
+              <w:t xml:space="preserve">Ønsker NFIF lavest mulig oppstartskostnad, kan posten for den ferdige løsningen fordeles på driftsprisen, med </w:t>
             </w:r>
             <w:r>
               <w:rPr>
@@ -4555,7 +4874,7 @@
               <w:spacing w:before="60" w:after="80"/>
             </w:pPr>
             <w:r>
-              <w:t xml:space="preserve">Etableringsprisen for gateløp omfatter integrasjonen mot EQ Timing. Den er bygget og i drift som prototype, jf. svar 1.2. EQ Timing var den største usikkerheten bak det opprinnelige intervallet, og vi kan derfor gi fastpris: </w:t>
+              <w:t xml:space="preserve">Etableringsprisen for gateløp omfatter integrasjonen mot EQ Timing, som tar tid i flest løp. Den er bygget og testet på hele 2026, jf. svar 1.2. EQ Timing var den største usikkerheten bak det opprinnelige intervallet. Den er nå avklart, og vi kan derfor gi fastpris: </w:t>
             </w:r>
             <w:r>
               <w:rPr>
@@ -4564,6 +4883,40 @@
               <w:t xml:space="preserve">300 000 kr</w:t>
             </w:r>
             <w:r>
+              <w:t xml:space="preserve">. Det er ikke lenger et intervall for selve etableringen.</w:t>
+            </w:r>
+          </w:p>
+          <w:p>
+            <w:pPr>
+              <w:spacing w:before="60" w:after="80"/>
+            </w:pPr>
+            <w:r>
+              <w:t xml:space="preserve">Fastprisen omfatter datamodell, import fra EQ Timing, løyperegister, kvalitetsnivå, årsbeste og rekordlister, terreng- og motbakkeløp, løpssider og samlet utøverprofil med bane og løp.</w:t>
+            </w:r>
+          </w:p>
+          <w:p>
+            <w:pPr>
+              <w:spacing w:before="60" w:after="80"/>
+            </w:pPr>
+            <w:r>
+              <w:t xml:space="preserve">Andre tidtakere kommer i tillegg, med </w:t>
+            </w:r>
+            <w:r>
+              <w:rPr>
+                <w:highlight w:val="yellow"/>
+              </w:rPr>
+              <w:t xml:space="preserve">30 000–50 000 kr</w:t>
+            </w:r>
+            <w:r>
+              <w:t xml:space="preserve"> per system. De relevante er Ultimate Sport Service, som tar tid i blant annet Oslo Maraton, og mindre systemer som Racedays. For Ultimate er importen bygget og formatet testet. Hvilke løp og resultater som skal inn, avklares med NFIF (svar 1.2), og grensesnittet med leverandøren (svar 1.5). Samlet forventet tillegg er </w:t>
+            </w:r>
+            <w:r>
+              <w:rPr>
+                <w:highlight w:val="yellow"/>
+              </w:rPr>
+              <w:t xml:space="preserve">30 000–100 000 kr</w:t>
+            </w:r>
+            <w:r>
               <w:t xml:space="preserve">.</w:t>
             </w:r>
           </w:p>
@@ -4572,7 +4925,7 @@
               <w:spacing w:before="60" w:after="80"/>
             </w:pPr>
             <w:r>
-              <w:t xml:space="preserve">Fastprisen omfatter datamodell, import fra EQ Timing, løyperegister, kvalitetsnivå, årsbeste og rekordlister, terreng- og motbakkeløp, løpssider og samlet utøverprofil med bane og gate.</w:t>
+              <w:t xml:space="preserve">Prisen forutsetter at tidtakeren tilbyr et dokumentert API eller en strukturert datafil, slik at arbeidet blir begrenset. Hvor i intervallet prisen havner, avgjøres av hvor godt grensesnittet er dokumentert. Må resultatene hentes fra resultatsider, krever det mer arbeid, både ved etablering og når tidtakeren endrer sidene, og det prises særskilt. Avgifter som tidtakeren eventuelt krever for tilgang, er ikke med i prisen og avtales særskilt.</w:t>
             </w:r>
           </w:p>
           <w:p>
@@ -4580,33 +4933,7 @@
               <w:spacing w:before="60" w:after="80"/>
             </w:pPr>
             <w:r>
-              <w:t xml:space="preserve">Andre tidtakere kommer i tillegg, med </w:t>
-            </w:r>
-            <w:r>
-              <w:rPr>
-                <w:highlight w:val="yellow"/>
-              </w:rPr>
-              <w:t xml:space="preserve">60 000–100 000 kr</w:t>
-            </w:r>
-            <w:r>
-              <w:t xml:space="preserve"> per system. Det relevante systemet er Ultimate Sport Service. Etter kartleggingen kan ett mindre tidtakersystem komme til. Samlet forventet tillegg er </w:t>
-            </w:r>
-            <w:r>
-              <w:rPr>
-                <w:highlight w:val="yellow"/>
-              </w:rPr>
-              <w:t xml:space="preserve">60 000–200 000 kr</w:t>
-            </w:r>
-            <w:r>
-              <w:t xml:space="preserve">.</w:t>
-            </w:r>
-          </w:p>
-          <w:p>
-            <w:pPr>
-              <w:spacing w:before="60" w:after="80"/>
-            </w:pPr>
-            <w:r>
-              <w:t xml:space="preserve">Det er ikke lenger et intervall for selve etableringen. Årlig registrering og vedlikehold av gateløp er </w:t>
+              <w:t xml:space="preserve">Årlig registrering og vedlikehold av gateløp er </w:t>
             </w:r>
             <w:r>
               <w:rPr>
@@ -5039,7 +5366,10 @@
                 <w:b/>
                 <w:bCs/>
               </w:rPr>
-              <w:t xml:space="preserve">Estimater for nødvendige integrasjoner:</w:t>
+              <w:t xml:space="preserve">Estimater for nødvendige integrasjoner.</w:t>
+            </w:r>
+            <w:r>
+              <w:t xml:space="preserve"> Prisene forutsetter at leverandøren tilbyr et dokumentert API eller en strukturert datafil. Da er arbeidet begrenset, og for LiveRes og Ultimate Sport Service er formatet allerede testet:</w:t>
             </w:r>
           </w:p>
           <w:p>
@@ -5057,7 +5387,7 @@
               <w:rPr>
                 <w:highlight w:val="yellow"/>
               </w:rPr>
-              <w:t xml:space="preserve">90 000–150 000 kr</w:t>
+              <w:t xml:space="preserve">50 000–80 000 kr</w:t>
             </w:r>
           </w:p>
           <w:p>
@@ -5075,7 +5405,7 @@
               <w:rPr>
                 <w:highlight w:val="yellow"/>
               </w:rPr>
-              <w:t xml:space="preserve">60 000–100 000 kr</w:t>
+              <w:t xml:space="preserve">30 000–50 000 kr</w:t>
             </w:r>
           </w:p>
           <w:p>
@@ -5093,7 +5423,7 @@
               <w:rPr>
                 <w:highlight w:val="yellow"/>
               </w:rPr>
-              <w:t xml:space="preserve">60 000–100 000 kr</w:t>
+              <w:t xml:space="preserve">30 000–50 000 kr</w:t>
             </w:r>
           </w:p>
           <w:p>
@@ -5117,7 +5447,7 @@
                 <w:bCs/>
                 <w:highlight w:val="yellow"/>
               </w:rPr>
-              <w:t xml:space="preserve">210 000–350 000 kr</w:t>
+              <w:t xml:space="preserve">110 000–180 000 kr</w:t>
             </w:r>
           </w:p>
           <w:p>
@@ -5125,6 +5455,14 @@
               <w:spacing w:before="60" w:after="80"/>
             </w:pPr>
             <w:r>
+              <w:t xml:space="preserve">Avgifter som leverandørene eventuelt krever for tilgang til sine grensesnitt, er ikke med i prisene og avtales særskilt. Må resultatene hentes fra offentlige resultatsider fordi det ikke finnes et grensesnitt, blir arbeidet større, og det prises særskilt.</w:t>
+            </w:r>
+          </w:p>
+          <w:p>
+            <w:pPr>
+              <w:spacing w:before="60" w:after="80"/>
+            </w:pPr>
+            <w:r>
               <w:rPr>
                 <w:b/>
                 <w:bCs/>
@@ -5147,76 +5485,70 @@
               <w:rPr>
                 <w:highlight w:val="yellow"/>
               </w:rPr>
-              <w:t xml:space="preserve">60 000–100 000 kr</w:t>
-            </w:r>
-          </w:p>
-          <w:p>
-            <w:pPr>
-              <w:spacing w:before="0" w:after="40"/>
-              <w:ind w:left="284" w:hanging="227"/>
-            </w:pPr>
-            <w:r>
-              <w:t xml:space="preserve">–	</w:t>
-            </w:r>
-            <w:r>
-              <w:t xml:space="preserve">Eldre statistikk: </w:t>
+              <w:t xml:space="preserve">30 000–50 000 kr</w:t>
+            </w:r>
+          </w:p>
+          <w:p>
+            <w:pPr>
+              <w:spacing w:before="0" w:after="40"/>
+              <w:ind w:left="284" w:hanging="227"/>
+            </w:pPr>
+            <w:r>
+              <w:t xml:space="preserve">–	</w:t>
+            </w:r>
+            <w:r>
+              <w:t xml:space="preserve">Eldre statistikk og kretsenes statistikker: prises i hvert enkelt tilfelle, jf. svar 1.6.</w:t>
+            </w:r>
+          </w:p>
+          <w:p>
+            <w:pPr>
+              <w:spacing w:before="0" w:after="40"/>
+              <w:ind w:left="284" w:hanging="227"/>
+            </w:pPr>
+            <w:r>
+              <w:t xml:space="preserve">–	</w:t>
+            </w:r>
+            <w:r>
+              <w:t xml:space="preserve">Øvrig utvikling: </w:t>
             </w:r>
             <w:r>
               <w:rPr>
                 <w:highlight w:val="yellow"/>
               </w:rPr>
-              <w:t xml:space="preserve">100 000 kr</w:t>
-            </w:r>
-          </w:p>
-          <w:p>
-            <w:pPr>
-              <w:spacing w:before="0" w:after="40"/>
-              <w:ind w:left="284" w:hanging="227"/>
-            </w:pPr>
-            <w:r>
-              <w:t xml:space="preserve">–	</w:t>
-            </w:r>
-            <w:r>
-              <w:t xml:space="preserve">Øvrig utvikling: </w:t>
+              <w:t xml:space="preserve">950 kr</w:t>
+            </w:r>
+            <w:r>
+              <w:t xml:space="preserve"> per time. Analyse og utredning: </w:t>
             </w:r>
             <w:r>
               <w:rPr>
                 <w:highlight w:val="yellow"/>
               </w:rPr>
-              <w:t xml:space="preserve">950 kr</w:t>
-            </w:r>
-            <w:r>
-              <w:t xml:space="preserve"> per time. Analyse og utredning: </w:t>
+              <w:t xml:space="preserve">1 100 kr</w:t>
+            </w:r>
+            <w:r>
+              <w:t xml:space="preserve"> per time.</w:t>
+            </w:r>
+          </w:p>
+          <w:p>
+            <w:pPr>
+              <w:spacing w:before="60" w:after="80"/>
+            </w:pPr>
+            <w:r>
+              <w:rPr>
+                <w:b/>
+                <w:bCs/>
+              </w:rPr>
+              <w:t xml:space="preserve">Forventet samlet kostnad over fem år</w:t>
+            </w:r>
+            <w:r>
+              <w:t xml:space="preserve">, med faste priser og nødvendige integrasjoner: </w:t>
             </w:r>
             <w:r>
               <w:rPr>
                 <w:highlight w:val="yellow"/>
               </w:rPr>
-              <w:t xml:space="preserve">1 100 kr</w:t>
-            </w:r>
-            <w:r>
-              <w:t xml:space="preserve"> per time.</w:t>
-            </w:r>
-          </w:p>
-          <w:p>
-            <w:pPr>
-              <w:spacing w:before="60" w:after="80"/>
-            </w:pPr>
-            <w:r>
-              <w:rPr>
-                <w:b/>
-                <w:bCs/>
-              </w:rPr>
-              <w:t xml:space="preserve">Forventet samlet kostnad over fem år</w:t>
-            </w:r>
-            <w:r>
-              <w:t xml:space="preserve">, med faste priser og nødvendige integrasjoner: </w:t>
-            </w:r>
-            <w:r>
-              <w:rPr>
-                <w:highlight w:val="yellow"/>
-              </w:rPr>
-              <w:t xml:space="preserve">3,36–3,50 mill. kr</w:t>
+              <w:t xml:space="preserve">3,26–3,33 mill. kr</w:t>
             </w:r>
             <w:r>
               <w:t xml:space="preserve">.</w:t>

</xml_diff>